<commit_message>
modificacion link codigo fuente
</commit_message>
<xml_diff>
--- a/1 Introduccion a Java/TP1/Trabajo Práctico - Introducción a Java - Sol Yoon.docx
+++ b/1 Introduccion a Java/TP1/Trabajo Práctico - Introducción a Java - Sol Yoon.docx
@@ -3230,13 +3230,7 @@
     </w:tbl>
     <w:p>
       <w:pPr>
-        <w:rPr>
-          <w:lang w:val="es-419"/>
-        </w:rPr>
-      </w:pPr>
-    </w:p>
-    <w:p>
-      <w:pPr>
+        <w:ind w:left="0" w:firstLine="0"/>
         <w:rPr>
           <w:lang w:val="es-419"/>
         </w:rPr>
@@ -3294,14 +3288,6 @@
         </w:rPr>
         <w:t>.</w:t>
       </w:r>
-    </w:p>
-    <w:p>
-      <w:pPr>
-        <w:rPr>
-          <w:rFonts w:eastAsiaTheme="minorEastAsia"/>
-          <w:lang w:val="es-419"/>
-        </w:rPr>
-      </w:pPr>
     </w:p>
     <w:p>
       <w:pPr>
@@ -3353,21 +3339,72 @@
           <w:lang w:val="es-419"/>
         </w:rPr>
       </w:pPr>
-      <w:r>
+      <w:hyperlink r:id="rId15" w:history="1">
+        <w:r>
+          <w:rPr>
+            <w:rStyle w:val="Hyperlink"/>
+            <w:rFonts w:eastAsiaTheme="minorEastAsia"/>
+            <w:lang w:val="es-419"/>
+          </w:rPr>
+          <w:t>https://github.com/bks99</w:t>
+        </w:r>
+        <w:r>
+          <w:rPr>
+            <w:rStyle w:val="Hyperlink"/>
+            <w:rFonts w:eastAsiaTheme="minorEastAsia"/>
+            <w:lang w:val="es-419"/>
+          </w:rPr>
+          <w:t>9</w:t>
+        </w:r>
+        <w:r>
+          <w:rPr>
+            <w:rStyle w:val="Hyperlink"/>
+            <w:rFonts w:eastAsiaTheme="minorEastAsia"/>
+            <w:lang w:val="es-419"/>
+          </w:rPr>
+          <w:t>/UTN-TUPaD-P2/tree/main/1%20Introduccion%20a%20Java/TP1</w:t>
+        </w:r>
+      </w:hyperlink>
+    </w:p>
+    <w:p>
+      <w:pPr>
         <w:rPr>
           <w:rFonts w:eastAsiaTheme="minorEastAsia"/>
-          <w:lang w:val="es-419"/>
-        </w:rPr>
-        <w:t>https://github.com/bks999/UTN-TUPaD-P2/tree/main/1%20Introduccion%20a%20Java/TP1</w:t>
+          <w:u w:val="single"/>
+          <w:lang w:val="es-419"/>
+        </w:rPr>
+      </w:pPr>
+      <w:r>
+        <w:rPr>
+          <w:rFonts w:eastAsiaTheme="minorEastAsia"/>
+          <w:u w:val="single"/>
+          <w:lang w:val="es-419"/>
+        </w:rPr>
+        <w:t>CODIGO FUENTE</w:t>
+      </w:r>
+    </w:p>
+    <w:p>
+      <w:pPr>
+        <w:rPr>
+          <w:rFonts w:eastAsiaTheme="minorEastAsia"/>
+          <w:lang w:val="es-419"/>
+        </w:rPr>
+      </w:pPr>
+      <w:r>
+        <w:rPr>
+          <w:rFonts w:eastAsiaTheme="minorEastAsia"/>
+          <w:lang w:val="es-419"/>
+        </w:rPr>
+        <w:t>https://github.com/bks999/UTN-TUPaD-P2/blob/main/1%20Introduccion%20a%20Java/TP1/Codigo/TrabajoPractico1/src/trabajopractico1/HolaMundo.java</w:t>
       </w:r>
     </w:p>
     <w:sectPr>
-      <w:headerReference w:type="even" r:id="rId15"/>
-      <w:headerReference w:type="default" r:id="rId16"/>
-      <w:footerReference w:type="even" r:id="rId17"/>
-      <w:footerReference w:type="default" r:id="rId18"/>
-      <w:headerReference w:type="first" r:id="rId19"/>
-      <w:footerReference w:type="first" r:id="rId20"/>
+      <w:headerReference w:type="even" r:id="rId16"/>
+      <w:headerReference w:type="default" r:id="rId17"/>
+      <w:footerReference w:type="even" r:id="rId18"/>
+      <w:footerReference w:type="default" r:id="rId19"/>
+      <w:headerReference w:type="first" r:id="rId20"/>
+      <w:footerReference w:type="first" r:id="rId21"/>
       <w:pgSz w:w="11920" w:h="16840"/>
       <w:pgMar w:top="1828" w:right="1750" w:bottom="1766" w:left="1701" w:header="108" w:footer="282" w:gutter="0"/>
       <w:cols w:space="720"/>
@@ -8523,6 +8560,41 @@
       <w:contextualSpacing/>
     </w:pPr>
   </w:style>
+  <w:style w:type="character" w:styleId="Hyperlink">
+    <w:name w:val="Hyperlink"/>
+    <w:basedOn w:val="DefaultParagraphFont"/>
+    <w:uiPriority w:val="99"/>
+    <w:unhideWhenUsed/>
+    <w:rsid w:val="000B6987"/>
+    <w:rPr>
+      <w:color w:val="467886" w:themeColor="hyperlink"/>
+      <w:u w:val="single"/>
+    </w:rPr>
+  </w:style>
+  <w:style w:type="character" w:styleId="UnresolvedMention">
+    <w:name w:val="Unresolved Mention"/>
+    <w:basedOn w:val="DefaultParagraphFont"/>
+    <w:uiPriority w:val="99"/>
+    <w:semiHidden/>
+    <w:unhideWhenUsed/>
+    <w:rsid w:val="000B6987"/>
+    <w:rPr>
+      <w:color w:val="605E5C"/>
+      <w:shd w:val="clear" w:color="auto" w:fill="E1DFDD"/>
+    </w:rPr>
+  </w:style>
+  <w:style w:type="character" w:styleId="FollowedHyperlink">
+    <w:name w:val="FollowedHyperlink"/>
+    <w:basedOn w:val="DefaultParagraphFont"/>
+    <w:uiPriority w:val="99"/>
+    <w:semiHidden/>
+    <w:unhideWhenUsed/>
+    <w:rsid w:val="000B6987"/>
+    <w:rPr>
+      <w:color w:val="96607D" w:themeColor="followedHyperlink"/>
+      <w:u w:val="single"/>
+    </w:rPr>
+  </w:style>
 </w:styles>
 </file>
 

</xml_diff>

<commit_message>
correccion error de link a repositorio
</commit_message>
<xml_diff>
--- a/1 Introduccion a Java/TP1/Trabajo Práctico - Introducción a Java - Sol Yoon.docx
+++ b/1 Introduccion a Java/TP1/Trabajo Práctico - Introducción a Java - Sol Yoon.docx
@@ -3309,44 +3309,49 @@
       <w:pPr>
         <w:rPr>
           <w:rFonts w:eastAsiaTheme="minorEastAsia"/>
+          <w:b/>
+          <w:bCs/>
           <w:u w:val="single"/>
           <w:lang w:val="es-419"/>
         </w:rPr>
       </w:pPr>
-      <w:proofErr w:type="gramStart"/>
-      <w:r>
+      <w:r>
+        <w:rPr>
+          <w:rFonts w:eastAsiaTheme="minorEastAsia"/>
+          <w:b/>
+          <w:bCs/>
+          <w:u w:val="single"/>
+          <w:lang w:val="es-419"/>
+        </w:rPr>
+        <w:t>ATAJOS A REPOSITORIO:</w:t>
+      </w:r>
+    </w:p>
+    <w:p>
+      <w:pPr>
         <w:rPr>
           <w:rFonts w:eastAsiaTheme="minorEastAsia"/>
           <w:u w:val="single"/>
           <w:lang w:val="es-419"/>
         </w:rPr>
-        <w:t>LINK</w:t>
-      </w:r>
-      <w:proofErr w:type="gramEnd"/>
-      <w:r>
-        <w:rPr>
-          <w:rFonts w:eastAsiaTheme="minorEastAsia"/>
-          <w:u w:val="single"/>
-          <w:lang w:val="es-419"/>
-        </w:rPr>
-        <w:t xml:space="preserve"> GITHUB DEL TRABAJO: </w:t>
-      </w:r>
-    </w:p>
-    <w:p>
-      <w:pPr>
-        <w:rPr>
-          <w:rFonts w:eastAsiaTheme="minorEastAsia"/>
-          <w:lang w:val="es-419"/>
-        </w:rPr>
       </w:pPr>
       <w:hyperlink r:id="rId15" w:history="1">
+        <w:proofErr w:type="gramStart"/>
         <w:r>
           <w:rPr>
             <w:rStyle w:val="Hyperlink"/>
             <w:rFonts w:eastAsiaTheme="minorEastAsia"/>
             <w:lang w:val="es-419"/>
           </w:rPr>
-          <w:t>https://github.com/bks99</w:t>
+          <w:t>LINK</w:t>
+        </w:r>
+        <w:proofErr w:type="gramEnd"/>
+        <w:r>
+          <w:rPr>
+            <w:rStyle w:val="Hyperlink"/>
+            <w:rFonts w:eastAsiaTheme="minorEastAsia"/>
+            <w:lang w:val="es-419"/>
+          </w:rPr>
+          <w:t xml:space="preserve"> GITHUB DEL</w:t>
         </w:r>
         <w:r>
           <w:rPr>
@@ -3354,7 +3359,7 @@
             <w:rFonts w:eastAsiaTheme="minorEastAsia"/>
             <w:lang w:val="es-419"/>
           </w:rPr>
-          <w:t>9</w:t>
+          <w:t xml:space="preserve"> </w:t>
         </w:r>
         <w:r>
           <w:rPr>
@@ -3362,49 +3367,70 @@
             <w:rFonts w:eastAsiaTheme="minorEastAsia"/>
             <w:lang w:val="es-419"/>
           </w:rPr>
-          <w:t>/UTN-TUPaD-P2/tree/main/1%20Introduccion%20a%20Java/TP1</w:t>
+          <w:t>TRABAJO</w:t>
         </w:r>
       </w:hyperlink>
-    </w:p>
-    <w:p>
-      <w:pPr>
+      <w:r>
         <w:rPr>
           <w:rFonts w:eastAsiaTheme="minorEastAsia"/>
           <w:u w:val="single"/>
           <w:lang w:val="es-419"/>
         </w:rPr>
-      </w:pPr>
-      <w:r>
+        <w:t xml:space="preserve"> </w:t>
+      </w:r>
+    </w:p>
+    <w:p>
+      <w:pPr>
         <w:rPr>
           <w:rFonts w:eastAsiaTheme="minorEastAsia"/>
           <w:u w:val="single"/>
           <w:lang w:val="es-419"/>
         </w:rPr>
-        <w:t>CODIGO FUENTE</w:t>
-      </w:r>
+      </w:pPr>
+      <w:hyperlink r:id="rId16" w:history="1">
+        <w:r>
+          <w:rPr>
+            <w:rStyle w:val="Hyperlink"/>
+            <w:rFonts w:eastAsiaTheme="minorEastAsia"/>
+            <w:lang w:val="es-419"/>
+          </w:rPr>
+          <w:t>CODIGO FUE</w:t>
+        </w:r>
+        <w:r>
+          <w:rPr>
+            <w:rStyle w:val="Hyperlink"/>
+            <w:rFonts w:eastAsiaTheme="minorEastAsia"/>
+            <w:lang w:val="es-419"/>
+          </w:rPr>
+          <w:t>N</w:t>
+        </w:r>
+        <w:r>
+          <w:rPr>
+            <w:rStyle w:val="Hyperlink"/>
+            <w:rFonts w:eastAsiaTheme="minorEastAsia"/>
+            <w:lang w:val="es-419"/>
+          </w:rPr>
+          <w:t>TE</w:t>
+        </w:r>
+      </w:hyperlink>
     </w:p>
     <w:p>
       <w:pPr>
         <w:rPr>
           <w:rFonts w:eastAsiaTheme="minorEastAsia"/>
-          <w:lang w:val="es-419"/>
-        </w:rPr>
-      </w:pPr>
-      <w:r>
-        <w:rPr>
-          <w:rFonts w:eastAsiaTheme="minorEastAsia"/>
-          <w:lang w:val="es-419"/>
-        </w:rPr>
-        <w:t>https://github.com/bks999/UTN-TUPaD-P2/blob/main/1%20Introduccion%20a%20Java/TP1/Codigo/TrabajoPractico1/src/trabajopractico1/HolaMundo.java</w:t>
-      </w:r>
+          <w:sz w:val="18"/>
+          <w:szCs w:val="20"/>
+          <w:lang w:val="es-419"/>
+        </w:rPr>
+      </w:pPr>
     </w:p>
     <w:sectPr>
-      <w:headerReference w:type="even" r:id="rId16"/>
-      <w:headerReference w:type="default" r:id="rId17"/>
-      <w:footerReference w:type="even" r:id="rId18"/>
-      <w:footerReference w:type="default" r:id="rId19"/>
-      <w:headerReference w:type="first" r:id="rId20"/>
-      <w:footerReference w:type="first" r:id="rId21"/>
+      <w:headerReference w:type="even" r:id="rId17"/>
+      <w:headerReference w:type="default" r:id="rId18"/>
+      <w:footerReference w:type="even" r:id="rId19"/>
+      <w:footerReference w:type="default" r:id="rId20"/>
+      <w:headerReference w:type="first" r:id="rId21"/>
+      <w:footerReference w:type="first" r:id="rId22"/>
       <w:pgSz w:w="11920" w:h="16840"/>
       <w:pgMar w:top="1828" w:right="1750" w:bottom="1766" w:left="1701" w:header="108" w:footer="282" w:gutter="0"/>
       <w:cols w:space="720"/>

</xml_diff>